<commit_message>
docs(tools): add Diataxis 4-quadrant docs for tools, API key pool setup, custom provider extension, and gstack lib
</commit_message>
<xml_diff>
--- a/0-Tong-Quan-Chuyen-Giao.docx
+++ b/0-Tong-Quan-Chuyen-Giao.docx
@@ -2,6 +2,14 @@
 <file path=word/document.xml><?xml version="1.0" encoding="utf-8"?>
 <w:document xmlns:wpc="http://schemas.microsoft.com/office/word/2010/wordprocessingCanvas" xmlns:mo="http://schemas.microsoft.com/office/mac/office/2008/main" xmlns:mc="http://schemas.openxmlformats.org/markup-compatibility/2006" xmlns:mv="urn:schemas-microsoft-com:mac:vml" xmlns:o="urn:schemas-microsoft-com:office:office" xmlns:r="http://schemas.openxmlformats.org/officeDocument/2006/relationships" xmlns:m="http://schemas.openxmlformats.org/officeDocument/2006/math" xmlns:v="urn:schemas-microsoft-com:vml" xmlns:wp14="http://schemas.microsoft.com/office/word/2010/wordprocessingDrawing" xmlns:wp="http://schemas.openxmlformats.org/drawingml/2006/wordprocessingDrawing" xmlns:w10="urn:schemas-microsoft-com:office:word" xmlns:w="http://schemas.openxmlformats.org/wordprocessingml/2006/main" xmlns:w14="http://schemas.microsoft.com/office/word/2010/wordml" xmlns:wpg="http://schemas.microsoft.com/office/word/2010/wordprocessingGroup" xmlns:wpi="http://schemas.microsoft.com/office/word/2010/wordprocessingInk" xmlns:wne="http://schemas.microsoft.com/office/word/2006/wordml" xmlns:wps="http://schemas.microsoft.com/office/word/2010/wordprocessingShape" mc:Ignorable="w14 wp14">
   <w:body>
+    <w:p>
+      <w:pPr>
+        <w:pStyle w:val="Title"/>
+      </w:pPr>
+      <w:r>
+        <w:t>AI-Native Methods · Tổng Quan Chuyển Giao &amp; Định Tuyến Công Cụ (2026.10)</w:t>
+      </w:r>
+    </w:p>
     <w:p>
       <w:pPr>
         <w:pStyle w:val="Heading1"/>
@@ -28,11 +36,6 @@
     <w:p>
       <w:r>
         <w:t>Bộ tài liệu chuyển giao ba phương pháp làm việc với AI cho sinh viên, giảng viên đại học và các nhóm phát triển sản phẩm. Mọi thương hiệu cụ thể đã được loại bỏ. Mỗi phương pháp đứng độc lập, có thể áp dụng riêng hoặc kết hợp thành một chuỗi liên hoàn từ thu thập tri thức internet, tổ chức nguồn sự thật nội bộ cho tới xây dựng và phát hành phần mềm.</w:t>
-      </w:r>
-    </w:p>
-    <w:p>
-      <w:r>
-        <w:t>---</w:t>
       </w:r>
     </w:p>
     <w:p>
@@ -136,28 +139,32 @@
       </w:r>
     </w:p>
     <w:p>
+      <w:pPr>
+        <w:pStyle w:val="ListBullet"/>
+      </w:pPr>
       <w:r>
-        <w:t>- **`tools/unified-search-mcp/`** chứa máy chủ MCP `Unified Search Pool v2.0` (định tuyến đa tín hiệu 8 chế độ qua `Tavily`, `Exa` và `Linkup` kèm xoay vòng khóa Round-Robin và mẫu `.mcp_env.example`).</w:t>
+        <w:t>**`tools/unified-search-mcp/`** chứa máy chủ MCP `Unified Search Pool v2.0` (định tuyến đa tín hiệu 8 chế độ qua `Tavily`, `Exa` và `Linkup` kèm xoay vòng khóa Round-Robin và mẫu `.mcp_env.example`).</w:t>
+      </w:r>
+    </w:p>
+    <w:p>
+      <w:pPr>
+        <w:pStyle w:val="ListBullet"/>
+      </w:pPr>
+      <w:r>
+        <w:t>**`tools/skills/`** chứa **58 kỹ năng phụ trợ (`Companion Skills`)** gồm 8 kỹ năng `tavily-*`, 19 kỹ năng `akkit` (`ak-fable-thinking`, `ak-graphify`, `ak-orchestrate`, `ak-ship`...) và 31 kỹ năng `gstack` (`scrape`, `skillify`, `setup-gbrain`, `sync-gbrain`, `autoplan`, `qa`, `cso`...).</w:t>
+      </w:r>
+    </w:p>
+    <w:p>
+      <w:pPr>
+        <w:pStyle w:val="ListBullet"/>
+      </w:pPr>
+      <w:r>
+        <w:t>**`tools/gstack-bin/`** và **`tools/hooks/`** chứa 21 tiện ích dòng lệnh (`gstack-wtree`, `gstack-evidence`, `gstack-verify-gate`...) và 13 mô-đun kiểm định hợp đồng PR (`pr-body-contract.cjs`, `writing-language.cjs`...).</w:t>
       </w:r>
     </w:p>
     <w:p>
       <w:r>
-        <w:t>- **`tools/skills/`** chứa **58 kỹ năng phụ trợ (`Companion Skills`)** gồm 8 kỹ năng `tavily-*`, 19 kỹ năng `akkit` (`ak-fable-thinking`, `ak-graphify`, `ak-orchestrate`, `ak-ship`...) và 31 kỹ năng `gstack` (`scrape`, `skillify`, `setup-gbrain`, `sync-gbrain`, `autoplan`, `qa`, `cso`...).</w:t>
-      </w:r>
-    </w:p>
-    <w:p>
-      <w:r>
-        <w:t>- **`tools/gstack-bin/`** và **`tools/hooks/`** chứa 21 tiện ích dòng lệnh (`gstack-wtree`, `gstack-evidence`, `gstack-verify-gate`...) và 13 mô-đun kiểm định hợp đồng PR (`pr-body-contract.cjs`, `writing-language.cjs`...).</w:t>
-      </w:r>
-    </w:p>
-    <w:p>
-      <w:r>
-        <w:t>📂 [`tools/`](./tools/)</w:t>
-      </w:r>
-    </w:p>
-    <w:p>
-      <w:r>
-        <w:t>---</w:t>
+        <w:t>📂 [`tools/`](./tools/) · 📖 [`docs/`](./docs/) (Tài liệu hướng dẫn cấu hình API Key Pool &amp; mở rộng công cụ theo chuẩn Diataxis: [Tutorial 15 phút](./docs/tutorial-first-15-minutes-with-tools.md) · [How-To thêm API Key &amp; thêm Provider mới](./docs/how-to-configure-and-extend-api-tools.md) · [Reference kỹ thuật](./docs/reference-tools-and-api-config.md) · [Giải thích kiến trúc](./docs/explanation-multi-signal-router-and-key-pool.md))</w:t>
       </w:r>
     </w:p>
     <w:p>
@@ -174,58 +181,27 @@
       </w:r>
     </w:p>
     <w:p>
-      <w:r>
-        <w:t>```</w:t>
-      </w:r>
-    </w:p>
-    <w:p>
+      <w:pPr>
+        <w:pStyle w:val="NoSpacing"/>
+      </w:pPr>
       <w:r>
         <w:t>Bo-XX-Ten-Phuong-Phap/</w:t>
-      </w:r>
-    </w:p>
-    <w:p>
-      <w:r>
+        <w:br/>
         <w:t>├── README.md            Tổng quan ngắn</w:t>
-      </w:r>
-    </w:p>
-    <w:p>
-      <w:r>
+        <w:br/>
         <w:t>├── Methodology.md       Triết lý và phương pháp chi tiết</w:t>
-      </w:r>
-    </w:p>
-    <w:p>
-      <w:r>
+        <w:br/>
         <w:t>├── Architecture.md      Kiến trúc kỹ thuật và thành phần</w:t>
-      </w:r>
-    </w:p>
-    <w:p>
-      <w:r>
+        <w:br/>
         <w:t>├── SKILL.md             Đặc tả skill để cài vào Claude, Antigravity hoặc agent khác</w:t>
-      </w:r>
-    </w:p>
-    <w:p>
-      <w:r>
+        <w:br/>
         <w:t>├── Quick-Start.md       Hướng dẫn bắt đầu trong 10 đến 20 phút</w:t>
-      </w:r>
-    </w:p>
-    <w:p>
-      <w:r>
+        <w:br/>
         <w:t>├── templates/           Bản mẫu sẵn dùng</w:t>
-      </w:r>
-    </w:p>
-    <w:p>
-      <w:r>
+        <w:br/>
         <w:t>├── references/          Tài liệu giao thức chuyên sâu (nạp theo ngữ cảnh)</w:t>
-      </w:r>
-    </w:p>
-    <w:p>
-      <w:r>
+        <w:br/>
         <w:t>└── examples/            Ví dụ thực chiến từ đầu đến cuối</w:t>
-      </w:r>
-    </w:p>
-    <w:p>
-      <w:r>
-        <w:t>```</w:t>
       </w:r>
     </w:p>
     <w:p>
@@ -234,18 +210,19 @@
       </w:r>
     </w:p>
     <w:p>
+      <w:pPr>
+        <w:pStyle w:val="ListBullet"/>
+      </w:pPr>
       <w:r>
-        <w:t>- **File `.docx`** ở root repo. Bản tài liệu cho người đọc, mở được trên Word, Pages, Google Docs.</w:t>
+        <w:t>**File `.docx`** ở root repo. Bản tài liệu cho người đọc, mở được trên Word, Pages, Google Docs.</w:t>
       </w:r>
     </w:p>
     <w:p>
+      <w:pPr>
+        <w:pStyle w:val="ListBullet"/>
+      </w:pPr>
       <w:r>
-        <w:t>- **File `.skill`** ở root repo. Bản đóng gói zip của `SKILL.md` cùng các thư mục `templates/`, `references/` và `examples/`. Cài vào Claude hoặc hệ thống AI agent bằng cách nạp file vào mục Skills.</w:t>
-      </w:r>
-    </w:p>
-    <w:p>
-      <w:r>
-        <w:t>---</w:t>
+        <w:t>**File `.skill`** ở root repo. Bản đóng gói zip của `SKILL.md` cùng các thư mục `templates/`, `references/` và `examples/`. Cài vào Claude hoặc hệ thống AI agent bằng cách nạp file vào mục Skills.</w:t>
       </w:r>
     </w:p>
     <w:p>
@@ -331,38 +308,23 @@
       </w:r>
     </w:p>
     <w:p>
-      <w:r>
-        <w:t xml:space="preserve">   ```bash</w:t>
-      </w:r>
-    </w:p>
-    <w:p>
+      <w:pPr>
+        <w:pStyle w:val="NoSpacing"/>
+      </w:pPr>
       <w:r>
         <w:t xml:space="preserve">   chmod +x tools/install-all.sh</w:t>
-      </w:r>
-    </w:p>
-    <w:p>
-      <w:r>
+        <w:br/>
         <w:t xml:space="preserve">   ./tools/install-all.sh</w:t>
       </w:r>
     </w:p>
     <w:p>
       <w:r>
-        <w:t xml:space="preserve">   ```</w:t>
-      </w:r>
-    </w:p>
-    <w:p>
-      <w:r>
-        <w:t xml:space="preserve">   Script sẽ cài đặt cả 3 Bộ Phương Pháp cốt lõi, 58 kỹ năng phụ trợ (`tavily-*`, `ak-*`, `gstack`), 21 tiện ích `gstack-bin`, 13 `hooks` và khởi tạo máy chủ MCP `unified-search` kèm file mẫu `~/.mcp_env`.</w:t>
+        <w:t>Script sẽ cài đặt cả 3 Bộ Phương Pháp cốt lõi, 58 kỹ năng phụ trợ (`tavily-*`, `ak-*`, `gstack`), 21 tiện ích `gstack-bin`, 13 `hooks` và khởi tạo máy chủ MCP `unified-search` kèm file mẫu `~/.mcp_env`.</w:t>
       </w:r>
     </w:p>
     <w:p>
       <w:r>
         <w:t>2. Nếu dùng Claude Desktop / Web, bạn cũng có thể tải trực tiếp các file `.skill` ở thư mục gốc (`internet-info-refinement.skill`, `kernel-registry-sot.skill`, `vibecode-kit-v6.skill`) vào mục Settings → Capabilities → Skills.</w:t>
-      </w:r>
-    </w:p>
-    <w:p>
-      <w:r>
-        <w:t>---</w:t>
       </w:r>
     </w:p>
     <w:p>
@@ -399,11 +361,6 @@
       </w:r>
     </w:p>
     <w:p>
-      <w:r>
-        <w:t>---</w:t>
-      </w:r>
-    </w:p>
-    <w:p>
       <w:pPr>
         <w:pStyle w:val="Heading2"/>
       </w:pPr>
@@ -417,88 +374,40 @@
       </w:r>
     </w:p>
     <w:p>
-      <w:r>
-        <w:t>```</w:t>
-      </w:r>
-    </w:p>
-    <w:p>
+      <w:pPr>
+        <w:pStyle w:val="NoSpacing"/>
+      </w:pPr>
       <w:r>
         <w:t>Bộ 01 v2.0 (Tinh lọc thông tin từ internet · PTC + Echo-Chamber Check)</w:t>
-      </w:r>
-    </w:p>
-    <w:p>
-      <w:r>
+        <w:br/>
         <w:t xml:space="preserve">   │</w:t>
-      </w:r>
-    </w:p>
-    <w:p>
-      <w:r>
+        <w:br/>
         <w:t xml:space="preserve">   │  Fact Cards hạng verified (exact_quote + content_hash)</w:t>
-      </w:r>
-    </w:p>
-    <w:p>
-      <w:r>
+        <w:br/>
         <w:t xml:space="preserve">   ▼</w:t>
-      </w:r>
-    </w:p>
-    <w:p>
-      <w:r>
+        <w:br/>
         <w:t>Bộ 02 v2.0 (Kernel Registry SOT · SHA-256 Freshness + L2 Tất định)</w:t>
-      </w:r>
-    </w:p>
-    <w:p>
-      <w:r>
+        <w:br/>
         <w:t xml:space="preserve">   │</w:t>
-      </w:r>
-    </w:p>
-    <w:p>
-      <w:r>
+        <w:br/>
         <w:t xml:space="preserve">   │  Con trỏ [L1-*], [L2-*], [OBL-*], [L4-*] trạng thái FRESH</w:t>
-      </w:r>
-    </w:p>
-    <w:p>
-      <w:r>
+        <w:br/>
         <w:t xml:space="preserve">   ▼</w:t>
-      </w:r>
-    </w:p>
-    <w:p>
-      <w:r>
+        <w:br/>
         <w:t>Bộ 03 v6.1 (Vibecode Kit · Worktree Isolation + Arbiter C3 + Dual-Stage Ship)</w:t>
-      </w:r>
-    </w:p>
-    <w:p>
-      <w:r>
+        <w:br/>
         <w:t xml:space="preserve">   │</w:t>
-      </w:r>
-    </w:p>
-    <w:p>
-      <w:r>
+        <w:br/>
         <w:t xml:space="preserve">   │  Sản phẩm phần mềm + WTREE_FINGERPRINT + Calibration Card 100 điểm</w:t>
-      </w:r>
-    </w:p>
-    <w:p>
-      <w:r>
+        <w:br/>
         <w:t xml:space="preserve">   ▼</w:t>
-      </w:r>
-    </w:p>
-    <w:p>
-      <w:r>
+        <w:br/>
         <w:t>Deliverable cuối đã kiểm chứng toàn diện</w:t>
       </w:r>
     </w:p>
     <w:p>
       <w:r>
-        <w:t>```</w:t>
-      </w:r>
-    </w:p>
-    <w:p>
-      <w:r>
         <w:t>Không bắt buộc dùng cả ba cùng lúc. Mỗi bộ đều có thể vận hành độc lập.</w:t>
-      </w:r>
-    </w:p>
-    <w:p>
-      <w:r>
-        <w:t>---</w:t>
       </w:r>
     </w:p>
     <w:p>
@@ -510,28 +419,35 @@
       </w:r>
     </w:p>
     <w:p>
+      <w:pPr>
+        <w:pStyle w:val="ListBullet"/>
+      </w:pPr>
       <w:r>
-        <w:t>- Sinh viên thạc sĩ và cử nhân năm cuối các ngành Phân tích dữ liệu, Trí tuệ nhân tạo, Khoa học máy tính, Hệ thống thông tin, Kinh tế lượng.</w:t>
+        <w:t>Sinh viên thạc sĩ và cử nhân năm cuối các ngành Phân tích dữ liệu, Trí tuệ nhân tạo, Khoa học máy tính, Hệ thống thông tin, Kinh tế lượng.</w:t>
       </w:r>
     </w:p>
     <w:p>
+      <w:pPr>
+        <w:pStyle w:val="ListBullet"/>
+      </w:pPr>
       <w:r>
-        <w:t>- Giảng viên hướng dẫn đồ án tốt nghiệp và luận văn.</w:t>
+        <w:t>Giảng viên hướng dẫn đồ án tốt nghiệp và luận văn.</w:t>
       </w:r>
     </w:p>
     <w:p>
+      <w:pPr>
+        <w:pStyle w:val="ListBullet"/>
+      </w:pPr>
       <w:r>
-        <w:t>- Nhóm khởi nghiệp và kỹ sư phát triển sản phẩm theo mô hình AI-Native.</w:t>
+        <w:t>Nhóm khởi nghiệp và kỹ sư phát triển sản phẩm theo mô hình AI-Native.</w:t>
       </w:r>
     </w:p>
     <w:p>
+      <w:pPr>
+        <w:pStyle w:val="ListBullet"/>
+      </w:pPr>
       <w:r>
-        <w:t>- Nghiên cứu sinh áp dụng vào đề tài thực nghiệm cá nhân.</w:t>
-      </w:r>
-    </w:p>
-    <w:p>
-      <w:r>
-        <w:t>---</w:t>
+        <w:t>Nghiên cứu sinh áp dụng vào đề tài thực nghiệm cá nhân.</w:t>
       </w:r>
     </w:p>
     <w:p>
@@ -545,11 +461,6 @@
     <w:p>
       <w:r>
         <w:t>Phiên bản hiện hành của toàn bộ kho tài liệu là **2026.10** (Bộ 01 v2.0, Bộ 02 v2.0 và Bộ 03 v6.1). Khi áp dụng vào dự án, vui lòng ghi rõ phiên bản đã sử dụng trong báo cáo để thuận tiện đối chiếu.</w:t>
-      </w:r>
-    </w:p>
-    <w:p>
-      <w:r>
-        <w:t>---</w:t>
       </w:r>
     </w:p>
     <w:p>
@@ -571,23 +482,27 @@
       </w:r>
     </w:p>
     <w:p>
+      <w:pPr>
+        <w:pStyle w:val="ListBullet"/>
+      </w:pPr>
       <w:r>
-        <w:t>- Không dùng dấu gạch ngang dài (em-dash) trong markdown (thay bằng dấu chấm, dấu phẩy hoặc dấu chấm giữa `·`)</w:t>
+        <w:t>Không dùng dấu gạch ngang dài (em-dash) trong markdown (thay bằng dấu chấm, dấu phẩy hoặc dấu chấm giữa `·`)</w:t>
       </w:r>
     </w:p>
     <w:p>
+      <w:pPr>
+        <w:pStyle w:val="ListBullet"/>
+      </w:pPr>
       <w:r>
-        <w:t>- Không đặt dấu phẩy trước chữ "và"</w:t>
+        <w:t>Không đặt dấu phẩy trước chữ "và"</w:t>
       </w:r>
     </w:p>
     <w:p>
+      <w:pPr>
+        <w:pStyle w:val="ListBullet"/>
+      </w:pPr>
       <w:r>
-        <w:t>- Không lạm dụng dấu hai chấm trong câu văn xuôi</w:t>
-      </w:r>
-    </w:p>
-    <w:p>
-      <w:r>
-        <w:t>---</w:t>
+        <w:t>Không lạm dụng dấu hai chấm trong câu văn xuôi</w:t>
       </w:r>
     </w:p>
     <w:p>
@@ -606,11 +521,6 @@
     <w:p>
       <w:r>
         <w:t>Copyright © 2026 Nguyễn Cảnh Lâm</w:t>
-      </w:r>
-    </w:p>
-    <w:p>
-      <w:r>
-        <w:t>---</w:t>
       </w:r>
     </w:p>
     <w:p>
@@ -642,11 +552,6 @@
       </w:r>
     </w:p>
     <w:p>
-      <w:r>
-        <w:t>---</w:t>
-      </w:r>
-    </w:p>
-    <w:p>
       <w:pPr>
         <w:pStyle w:val="Heading2"/>
       </w:pPr>
@@ -660,28 +565,224 @@
       </w:r>
     </w:p>
     <w:p>
+      <w:pPr>
+        <w:pStyle w:val="NoSpacing"/>
+      </w:pPr>
       <w:r>
-        <w:t>```</w:t>
+        <w:t>Nguyễn, C. L. (2026). AI-Native Methods · Ba phương pháp làm việc với AI</w:t>
+        <w:br/>
+        <w:t>(Version 2026.10 · Bộ 01 v2.0, Bộ 02 v2.0, Bộ 03 v6.1) [Computer software]. GitHub.</w:t>
+        <w:br/>
+        <w:t>https://github.com/lucas-dunght/ai-native-methods</w:t>
+      </w:r>
+    </w:p>
+    <w:p>
+      <w:pPr>
+        <w:pStyle w:val="Heading1"/>
+      </w:pPr>
+      <w:r>
+        <w:t>CLAUDE.md · Chỉ Dẫn Điều Phối AI Agent Cho Kho Lưu Trữ `ai-native-methods` (`2026.10`)</w:t>
       </w:r>
     </w:p>
     <w:p>
       <w:r>
-        <w:t>Nguyễn, C. L. (2026). AI-Native Methods · Ba phương pháp làm việc với AI</w:t>
+        <w:t>Kho lưu trữ này chứa **3 Bộ Phương Pháp Làm Việc Cùng AI** cùng toàn bộ hệ sinh thái công cụ thực thi nằm trong thư mục [`tools/`](./tools/) và bộ tài liệu hướng dẫn kỹ thuật trong [`docs/`](./docs/).</w:t>
+      </w:r>
+    </w:p>
+    <w:p>
+      <w:pPr>
+        <w:pStyle w:val="Heading2"/>
+      </w:pPr>
+      <w:r>
+        <w:t>1. Cấu Trúc Kho Lưu Trữ &amp; Khởi Tạo Nhanh</w:t>
+      </w:r>
+    </w:p>
+    <w:p>
+      <w:pPr>
+        <w:pStyle w:val="ListBullet"/>
+      </w:pPr>
+      <w:r>
+        <w:t>`Bo-01-Tinh-Loc-Thong-Tin-Internet/` (`internet-info-refinement` v2.0): Phương pháp tinh lọc và làm giàu thông tin từ internet qua 7 giai đoạn.</w:t>
+      </w:r>
+    </w:p>
+    <w:p>
+      <w:pPr>
+        <w:pStyle w:val="ListBullet"/>
+      </w:pPr>
+      <w:r>
+        <w:t>`Bo-02-Kernel-Registry-SOT/` (`kernel-registry-sot` v2.0): Phương pháp quản trị Nguồn Sự Thật Đa Xuất Xứ (`L1 / L2 / L3 / L4`).</w:t>
+      </w:r>
+    </w:p>
+    <w:p>
+      <w:pPr>
+        <w:pStyle w:val="ListBullet"/>
+      </w:pPr>
+      <w:r>
+        <w:t>`Bo-03-Vibecode-Kit-v6/` (`vibecode-kit-v6` v6.1): Phương pháp xây dựng và phát hành phần mềm điều phối đa tác tử theo 8 bước co giãn theo tầng rủi ro `R0..R3`.</w:t>
+      </w:r>
+    </w:p>
+    <w:p>
+      <w:pPr>
+        <w:pStyle w:val="ListBullet"/>
+      </w:pPr>
+      <w:r>
+        <w:t>`tools/`: Chứa trình cài đặt 1 lệnh `./tools/install-all.sh`, máy chủ MCP `unified-search` (`tools/unified-search-mcp/`), 58 kỹ năng phụ trợ (`tools/skills/{tavily,akkit,gstack}/`), 21 tiện ích dòng lệnh (`tools/gstack-bin/`) và 13 mô-đun kiểm định (`tools/hooks/`).</w:t>
+      </w:r>
+    </w:p>
+    <w:p>
+      <w:pPr>
+        <w:pStyle w:val="ListBullet"/>
+      </w:pPr>
+      <w:r>
+        <w:t>`docs/`: Bộ tài liệu hướng dẫn công cụ và cấu hình API theo chuẩn Diataxis 4 góc nhìn (`Tutorial`, `How-To`, `Reference`, `Explanation`).</w:t>
+      </w:r>
+    </w:p>
+    <w:p>
+      <w:pPr>
+        <w:pStyle w:val="Heading2"/>
+      </w:pPr>
+      <w:r>
+        <w:t>2. Quy Tắc An Ninh &amp; Bảo Mật Khóa API (`Zero-Secret Policy`)</w:t>
       </w:r>
     </w:p>
     <w:p>
       <w:r>
-        <w:t>(Version 2026.10 · Bộ 01 v2.0, Bộ 02 v2.0, Bộ 03 v6.1) [Computer software]. GitHub.</w:t>
+        <w:t>1. **Không bao giờ đưa API Key hoặc Token vào Git.** Mọi khóa API (`TAVILY_KEY_POOL`, `EXA_KEY_POOL`, `LINKUP_KEY_POOL`, `TAVILY_API_KEY`, `GEMINI_API_KEY`, `OPENAI_API_KEY`) bắt buộc lưu tại `~/.mcp_env` (quyền `0600`, nằm ngoài kho lưu trữ). Trong kho lưu trữ chỉ lưu file mẫu [`tools/unified-search-mcp/.mcp_env.example`](./tools/unified-search-mcp/.mcp_env.example).</w:t>
       </w:r>
     </w:p>
     <w:p>
       <w:r>
-        <w:t>https://github.com/lucas-dunght/ai-native-methods</w:t>
+        <w:t>2. **Kiểm tra chống rò rỉ trước khi commit/push.** Luôn chạy kiểm tra bằng `./tools/gstack-bin/gstack-redact` hoặc xác nhận không có chuỗi khóa thật trước khi đẩy mã nguồn lên GitHub.</w:t>
       </w:r>
     </w:p>
     <w:p>
       <w:r>
-        <w:t>```</w:t>
+        <w:t>3. **Quy tắc văn phong kho lưu trữ (`Constraint Loop`).** Mọi tài liệu Markdown tiếng Việt trong kho lưu trữ này tuân thủ hai quy tắc cơ học:</w:t>
+      </w:r>
+    </w:p>
+    <w:p>
+      <w:pPr>
+        <w:pStyle w:val="ListBullet"/>
+      </w:pPr>
+      <w:r>
+        <w:t>Không sử dụng dấu gạch ngang dài (`em-dash`). Thay bằng dấu chấm, dấu phẩy hoặc dấu chấm giữa `·`.</w:t>
+      </w:r>
+    </w:p>
+    <w:p>
+      <w:pPr>
+        <w:pStyle w:val="ListBullet"/>
+      </w:pPr>
+      <w:r>
+        <w:t>Không đặt dấu phẩy ngay trước chữ `"và"`.</w:t>
+      </w:r>
+    </w:p>
+    <w:p>
+      <w:pPr>
+        <w:pStyle w:val="Heading2"/>
+      </w:pPr>
+      <w:r>
+        <w:t>3. Bảng Định Tuyến Kỹ Năng (`Skill Routing`)</w:t>
+      </w:r>
+    </w:p>
+    <w:p>
+      <w:r>
+        <w:t>Khi yêu cầu của người dùng khớp với một trong các tác vụ dưới đây, hãy ưu tiên kích hoạt kỹ năng tương ứng đã được cài đặt từ kho lưu trữ này:</w:t>
+      </w:r>
+    </w:p>
+    <w:p>
+      <w:pPr>
+        <w:pStyle w:val="Heading3"/>
+      </w:pPr>
+      <w:r>
+        <w:t>3.1. Định tuyến 3 Bộ Phương Pháp Cốt Lõi</w:t>
+      </w:r>
+    </w:p>
+    <w:p>
+      <w:pPr>
+        <w:pStyle w:val="ListBullet"/>
+      </w:pPr>
+      <w:r>
+        <w:t>Thu thập, kiểm chứng chéo thông tin từ internet, lập thẻ `Fact Card`, khử phòng vang trích dẫn (`Echo-Chamber Check`) -&gt; Kích hoạt **`/internet-info-refinement`** (`Bo-01-Tinh-Loc-Thong-Tin-Internet/SKILL.md`).</w:t>
+      </w:r>
+    </w:p>
+    <w:p>
+      <w:pPr>
+        <w:pStyle w:val="ListBullet"/>
+      </w:pPr>
+      <w:r>
+        <w:t>Tổ chức kho tri thức nội bộ theo 4 xuất xứ (`L1/L2/L3/L4`), kiểm toán mã băm SHA-256 (`FRESH/STALE/EXPIRED`), tính toán dẫn xuất `L2` tất định -&gt; Kích hoạt **`/kernel-registry-sot`** (`Bo-02-Kernel-Registry-SOT/SKILL.md`).</w:t>
+      </w:r>
+    </w:p>
+    <w:p>
+      <w:pPr>
+        <w:pStyle w:val="ListBullet"/>
+      </w:pPr>
+      <w:r>
+        <w:t>Điều phối dự án phần mềm từ khảo sát (`SCAN`), phỏng vấn ngược (`RRI`), thiết kế kiến trúc (`BLUEPRINT`), chia gói `TIP`, thi công đa `worktree` đến phát hành -&gt; Kích hoạt **`/vibecode-kit-v6`** (`Bo-03-Vibecode-Kit-v6/SKILL.md`).</w:t>
+      </w:r>
+    </w:p>
+    <w:p>
+      <w:pPr>
+        <w:pStyle w:val="Heading3"/>
+      </w:pPr>
+      <w:r>
+        <w:t>3.2. Định tuyến Hệ Sinh Thái Công Cụ Phụ Trợ (`tools/skills/`)</w:t>
+      </w:r>
+    </w:p>
+    <w:p>
+      <w:pPr>
+        <w:pStyle w:val="ListBullet"/>
+      </w:pPr>
+      <w:r>
+        <w:t>**Tìm kiếm đa tín hiệu &amp; lọc ngữ cảnh PTC:** Ưu tiên gọi MCP `unified-search` (`web_search`, `web_extract`, `pool_status`) kết hợp `/tavily-dynamic-search`, `/tavily-map`, `/tavily-crawl`, `/tavily-research`.</w:t>
+      </w:r>
+    </w:p>
+    <w:p>
+      <w:pPr>
+        <w:pStyle w:val="ListBullet"/>
+      </w:pPr>
+      <w:r>
+        <w:t>**Cào dữ liệu từ phiên trình duyệt đã đăng nhập:** Kích hoạt `/scrape` và đóng băng thành kỹ năng 200ms qua `/skillify` (dùng `/setup-browser-cookies` khi cần đồng bộ phiên).</w:t>
+      </w:r>
+    </w:p>
+    <w:p>
+      <w:pPr>
+        <w:pStyle w:val="ListBullet"/>
+      </w:pPr>
+      <w:r>
+        <w:t>**Xây dựng đồ thị tri thức &amp; đồng bộ GBrain:** Kích hoạt `/ak-graphify`, `/setup-gbrain` và `/sync-gbrain`.</w:t>
+      </w:r>
+    </w:p>
+    <w:p>
+      <w:pPr>
+        <w:pStyle w:val="ListBullet"/>
+      </w:pPr>
+      <w:r>
+        <w:t>**Phân tích chiến lược, kiến trúc &amp; duyệt kế hoạch 4 góc nhìn:** Kích hoạt `/ak-brainstorm`, `/ak-plan`, `/plan-ceo-review`, `/plan-eng-review`, `/plan-design-review`, `/plan-devex-review` hoặc `/autoplan`.</w:t>
+      </w:r>
+    </w:p>
+    <w:p>
+      <w:pPr>
+        <w:pStyle w:val="ListBullet"/>
+      </w:pPr>
+      <w:r>
+        <w:t>**Thi công, gỡ lỗi, kiểm thử &amp; kiểm toán bảo mật:** Kích hoạt `/ak-cook`, `/ak-fix`, `/ak-debug`, `/investigate`, `/qa`, `/qa-only`, `/test-audit`, `/ak-security` hoặc `/cso`.</w:t>
+      </w:r>
+    </w:p>
+    <w:p>
+      <w:pPr>
+        <w:pStyle w:val="ListBullet"/>
+      </w:pPr>
+      <w:r>
+        <w:t>**Điều phối song song, bàn giao phiên &amp; phát hành:** Kích hoạt `/ak-worktree`, `/ak-orchestrate`, `/ak-handoff`, `/context-save`, `/context-restore`, `/review`, `/ak-review-pr`, `/ak-ship`, `/ship` hoặc `/land-and-deploy`.</w:t>
+      </w:r>
+    </w:p>
+    <w:p>
+      <w:pPr>
+        <w:pStyle w:val="ListBullet"/>
+      </w:pPr>
+      <w:r>
+        <w:t>**Viết mới hoặc đồng bộ tài liệu kỹ thuật:** Kích hoạt `/document-generate` hoặc `/document-release`.</w:t>
       </w:r>
     </w:p>
     <w:sectPr>

</xml_diff>